<commit_message>
Reposition portfolio and CVs for marine and offshore electrical roles
Co-Authored-By: Claude Sonnet 5.5 <noreply@anthropic.com>
Claude-Session: https://claude.ai/code/session_01VhLvZUzvdkDx1QQCTQeo62
</commit_message>
<xml_diff>
--- a/assets/Mashuk_Elahi_Resume_Europass_rev4.docx
+++ b/assets/Mashuk_Elahi_Resume_Europass_rev4.docx
@@ -32,7 +32,7 @@
           <w:sz w:val="21"/>
           <w:szCs w:val="21"/>
         </w:rPr>
-        <w:t xml:space="preserve">Critical Facilities &amp; Commissioning Engineer | MV 11 kV, UPS, EPMS &amp; BESS</w:t>
+        <w:t xml:space="preserve">Marine &amp; Offshore Electrical Engineer | Hybrid Power, BESS &amp; Commissioning</w:t>
       </w:r>
     </w:p>
     <w:p>
@@ -223,7 +223,7 @@
           <w:sz w:val="20"/>
           <w:szCs w:val="20"/>
         </w:rPr>
-        <w:t xml:space="preserve">Electrical and commissioning engineer with 16 years of experience in MV/LV distribution, MV 11 kV switchgear, UPS, battery energy storage (BESS), protection systems, and EPMS/SCADA. I take systems from Factory Acceptance Testing through energisation to handover. My recent focus is semiconductor critical-power in N+1 environments — 30 MW (33 MVA) of critical load at 1.5 kW/m² fab power density with zero audit rework — backed by an industrial and EPC record in cogeneration, autonomous renewable power, and IECEx/ATEX hazardous areas. CDCP certified, ISO 9001 and ISO 50001 Lead Auditor. Open to roles across Europe, the UAE, and Singapore.</w:t>
+        <w:t xml:space="preserve">Electrical engineer with 16 years of experience in marine, offshore and vessel newbuild work: LV/MV distribution, single-line diagrams, load lists and cable schedules, MV 11 kV switchgear, protection systems, battery energy storage (BESS) and hybrid power. I take systems from Factory Acceptance Testing through class approval and energisation to handover, and I build Python tools that keep engineering documents consistent. Earlier work includes semiconductor critical-power (30 MW / 33 MVA, zero audit rework), cogeneration and IECEx/ATEX hazardous areas. CDCP certificate held; ISO 9001 and ISO 50001 Lead Auditor. Open to roles across Singapore, Europe and the UAE.</w:t>
       </w:r>
     </w:p>
     <w:p>

</xml_diff>